<commit_message>
docs: add macOS cannot-open troubleshooting to bilingual manuals
</commit_message>
<xml_diff>
--- a/User-Manual.docx
+++ b/User-Manual.docx
@@ -819,6 +819,53 @@
           </w:p>
         </w:tc>
       </w:tr>
+      <w:tr>
+        <w:tc>
+          <w:tcPr>
+            <w:tcW w:type="dxa" w:w="4968"/>
+          </w:tcPr>
+          <w:p>
+            <w:r>
+              <w:t>macOS app/launcher will not open (“cannot be verified” / “is damaged”)</w:t>
+            </w:r>
+          </w:p>
+        </w:tc>
+        <w:tc>
+          <w:tcPr>
+            <w:tcW w:type="dxa" w:w="4968"/>
+          </w:tcPr>
+          <w:p>
+            <w:r>
+              <w:t>① Open the Terminal app, type cd followed by a space, drag the whole project folder into the Terminal window, press Enter, then run these two commands:</w:t>
+            </w:r>
+          </w:p>
+          <w:p>
+            <w:r>
+              <w:t>xattr -cr .</w:t>
+            </w:r>
+          </w:p>
+          <w:p>
+            <w:r>
+              <w:t>chmod +x 双击打开序证工作台.command 序证工作台.app/Contents/MacOS/launcher</w:t>
+            </w:r>
+          </w:p>
+          <w:p>
+            <w:r>
+              <w:t>② Control-click (right-click) the launcher → choose Open → click Open in the dialog.</w:t>
+            </w:r>
+          </w:p>
+          <w:p>
+            <w:r>
+              <w:t>③ System Settings → Privacy &amp; Security → find the program → click Open Anyway.</w:t>
+            </w:r>
+          </w:p>
+          <w:p>
+            <w:r>
+              <w:t>④ If it says “app is damaged and can’t be opened”, run xattr -cr &lt;path-to-project-folder&gt; once and try again.</w:t>
+            </w:r>
+          </w:p>
+        </w:tc>
+      </w:tr>
     </w:tbl>
     <w:p/>
     <w:sectPr>

</xml_diff>

<commit_message>
revert manual macOS note; remove upload guide docx
</commit_message>
<xml_diff>
--- a/User-Manual.docx
+++ b/User-Manual.docx
@@ -819,53 +819,6 @@
           </w:p>
         </w:tc>
       </w:tr>
-      <w:tr>
-        <w:tc>
-          <w:tcPr>
-            <w:tcW w:type="dxa" w:w="4968"/>
-          </w:tcPr>
-          <w:p>
-            <w:r>
-              <w:t>macOS app/launcher will not open (“cannot be verified” / “is damaged”)</w:t>
-            </w:r>
-          </w:p>
-        </w:tc>
-        <w:tc>
-          <w:tcPr>
-            <w:tcW w:type="dxa" w:w="4968"/>
-          </w:tcPr>
-          <w:p>
-            <w:r>
-              <w:t>① Open the Terminal app, type cd followed by a space, drag the whole project folder into the Terminal window, press Enter, then run these two commands:</w:t>
-            </w:r>
-          </w:p>
-          <w:p>
-            <w:r>
-              <w:t>xattr -cr .</w:t>
-            </w:r>
-          </w:p>
-          <w:p>
-            <w:r>
-              <w:t>chmod +x 双击打开序证工作台.command 序证工作台.app/Contents/MacOS/launcher</w:t>
-            </w:r>
-          </w:p>
-          <w:p>
-            <w:r>
-              <w:t>② Control-click (right-click) the launcher → choose Open → click Open in the dialog.</w:t>
-            </w:r>
-          </w:p>
-          <w:p>
-            <w:r>
-              <w:t>③ System Settings → Privacy &amp; Security → find the program → click Open Anyway.</w:t>
-            </w:r>
-          </w:p>
-          <w:p>
-            <w:r>
-              <w:t>④ If it says “app is damaged and can’t be opened”, run xattr -cr &lt;path-to-project-folder&gt; once and try again.</w:t>
-            </w:r>
-          </w:p>
-        </w:tc>
-      </w:tr>
     </w:tbl>
     <w:p/>
     <w:sectPr>

</xml_diff>

<commit_message>
docs: add official tool download links to README and manuals
</commit_message>
<xml_diff>
--- a/User-Manual.docx
+++ b/User-Manual.docx
@@ -40,7 +40,19 @@
         <w:pStyle w:val="ListBullet"/>
       </w:pPr>
       <w:r>
-        <w:t>macOS or Windows, Node.js 22 or later, and npm.</w:t>
+        <w:t xml:space="preserve">macOS or Windows, </w:t>
+      </w:r>
+      <w:hyperlink r:id="rId10">
+        <w:r>
+          <w:rPr>
+            <w:color w:val="0563C1"/>
+            <w:u w:val="single"/>
+          </w:rPr>
+          <w:t>Node.js 22 (official download)</w:t>
+        </w:r>
+      </w:hyperlink>
+      <w:r>
+        <w:t xml:space="preserve"> or later, and npm (bundled with Node.js automatically).</w:t>
       </w:r>
     </w:p>
     <w:p>
@@ -48,7 +60,55 @@
         <w:pStyle w:val="ListBullet"/>
       </w:pPr>
       <w:r>
-        <w:t>Optional command-line tools: FastQC, Cutadapt, tRNAscan-SE, and BLAST+. Install only the tools needed for the analyses you plan to run; they are not bundled with this repository.</w:t>
+        <w:t xml:space="preserve">Optional command-line tools: </w:t>
+      </w:r>
+      <w:hyperlink r:id="rId11">
+        <w:r>
+          <w:rPr>
+            <w:color w:val="0563C1"/>
+            <w:u w:val="single"/>
+          </w:rPr>
+          <w:t>FastQC</w:t>
+        </w:r>
+      </w:hyperlink>
+      <w:r>
+        <w:t xml:space="preserve">, </w:t>
+      </w:r>
+      <w:hyperlink r:id="rId12">
+        <w:r>
+          <w:rPr>
+            <w:color w:val="0563C1"/>
+            <w:u w:val="single"/>
+          </w:rPr>
+          <w:t>Cutadapt</w:t>
+        </w:r>
+      </w:hyperlink>
+      <w:r>
+        <w:t xml:space="preserve">, </w:t>
+      </w:r>
+      <w:hyperlink r:id="rId13">
+        <w:r>
+          <w:rPr>
+            <w:color w:val="0563C1"/>
+            <w:u w:val="single"/>
+          </w:rPr>
+          <w:t>tRNAscan-SE</w:t>
+        </w:r>
+      </w:hyperlink>
+      <w:r>
+        <w:t xml:space="preserve">, and </w:t>
+      </w:r>
+      <w:hyperlink r:id="rId14">
+        <w:r>
+          <w:rPr>
+            <w:color w:val="0563C1"/>
+            <w:u w:val="single"/>
+          </w:rPr>
+          <w:t>BLAST+</w:t>
+        </w:r>
+      </w:hyperlink>
+      <w:r>
+        <w:t>. Install only the tools needed for the corresponding steps; the project does not bundle them.</w:t>
       </w:r>
     </w:p>
     <w:p>

</xml_diff>

<commit_message>
docs: add macOS Gatekeeper troubleshooting; rename Chinese manual to English filename
</commit_message>
<xml_diff>
--- a/User-Manual.docx
+++ b/User-Manual.docx
@@ -620,6 +620,46 @@
         <w:t>7. Troubleshooting</w:t>
       </w:r>
     </w:p>
+    <w:p>
+      <w:r>
+        <w:rPr>
+          <w:b/>
+        </w:rPr>
+        <w:t>macOS cannot open the app (Gatekeeper block)</w:t>
+      </w:r>
+    </w:p>
+    <w:p>
+      <w:r>
+        <w:rPr>
+          <w:b w:val="0"/>
+        </w:rPr>
+        <w:t>Symptoms: “cannot be opened because Apple cannot check it for malicious software”, “cannot verify the developer”, or “is damaged and cannot be opened”.</w:t>
+      </w:r>
+    </w:p>
+    <w:p>
+      <w:r>
+        <w:rPr>
+          <w:b w:val="0"/>
+        </w:rPr>
+        <w:t>Cause: files downloaded from GitHub carry a macOS quarantine attribute, so the first launch is blocked by Gatekeeper.</w:t>
+      </w:r>
+    </w:p>
+    <w:p>
+      <w:r>
+        <w:rPr>
+          <w:b w:val="0"/>
+        </w:rPr>
+        <w:t>Fix (choose one): ① Right-click (or Control-click) Sequence-Evidence-Workbench.app → Open → click Open in the dialog; ② Open System Settings → Privacy &amp; Security → Security, then click Open Anyway (Allow Anyway); ③ If it still will not open, run in Terminal: xattr -dr com.apple.quarantine "/path/to/Sequence-Evidence-Workbench.app" (e.g. xattr -dr com.apple.quarantine ~/Downloads/Sequence-Evidence-Workbench.app); ④ If it says “damaged”, run the same command, then double-click to launch again.</w:t>
+      </w:r>
+    </w:p>
+    <w:p>
+      <w:r>
+        <w:rPr>
+          <w:b w:val="0"/>
+        </w:rPr>
+        <w:t>Note: apply this only when macOS blocks the app; clearing the quarantine attribute affects only your machine. If double-clicking Launch-Workbench.command does nothing, right-click it and choose Open.</w:t>
+      </w:r>
+    </w:p>
     <w:tbl>
       <w:tblPr>
         <w:tblStyle w:val="TableGrid"/>

</xml_diff>

<commit_message>
revert: remove macOS troubleshooting additions, restore Chinese manual filename
</commit_message>
<xml_diff>
--- a/User-Manual.docx
+++ b/User-Manual.docx
@@ -620,46 +620,6 @@
         <w:t>7. Troubleshooting</w:t>
       </w:r>
     </w:p>
-    <w:p>
-      <w:r>
-        <w:rPr>
-          <w:b/>
-        </w:rPr>
-        <w:t>macOS cannot open the app (Gatekeeper block)</w:t>
-      </w:r>
-    </w:p>
-    <w:p>
-      <w:r>
-        <w:rPr>
-          <w:b w:val="0"/>
-        </w:rPr>
-        <w:t>Symptoms: “cannot be opened because Apple cannot check it for malicious software”, “cannot verify the developer”, or “is damaged and cannot be opened”.</w:t>
-      </w:r>
-    </w:p>
-    <w:p>
-      <w:r>
-        <w:rPr>
-          <w:b w:val="0"/>
-        </w:rPr>
-        <w:t>Cause: files downloaded from GitHub carry a macOS quarantine attribute, so the first launch is blocked by Gatekeeper.</w:t>
-      </w:r>
-    </w:p>
-    <w:p>
-      <w:r>
-        <w:rPr>
-          <w:b w:val="0"/>
-        </w:rPr>
-        <w:t>Fix (choose one): ① Right-click (or Control-click) Sequence-Evidence-Workbench.app → Open → click Open in the dialog; ② Open System Settings → Privacy &amp; Security → Security, then click Open Anyway (Allow Anyway); ③ If it still will not open, run in Terminal: xattr -dr com.apple.quarantine "/path/to/Sequence-Evidence-Workbench.app" (e.g. xattr -dr com.apple.quarantine ~/Downloads/Sequence-Evidence-Workbench.app); ④ If it says “damaged”, run the same command, then double-click to launch again.</w:t>
-      </w:r>
-    </w:p>
-    <w:p>
-      <w:r>
-        <w:rPr>
-          <w:b w:val="0"/>
-        </w:rPr>
-        <w:t>Note: apply this only when macOS blocks the app; clearing the quarantine attribute affects only your machine. If double-clicking Launch-Workbench.command does nothing, right-click it and choose Open.</w:t>
-      </w:r>
-    </w:p>
     <w:tbl>
       <w:tblPr>
         <w:tblStyle w:val="TableGrid"/>

</xml_diff>

<commit_message>
docs: add macOS Gatekeeper troubleshooting to both manuals (Chinese/English)
</commit_message>
<xml_diff>
--- a/User-Manual.docx
+++ b/User-Manual.docx
@@ -620,6 +620,46 @@
         <w:t>7. Troubleshooting</w:t>
       </w:r>
     </w:p>
+    <w:p>
+      <w:r>
+        <w:rPr>
+          <w:b/>
+        </w:rPr>
+        <w:t>macOS cannot open the app (Gatekeeper block)</w:t>
+      </w:r>
+    </w:p>
+    <w:p>
+      <w:r>
+        <w:rPr>
+          <w:b w:val="0"/>
+        </w:rPr>
+        <w:t>Symptoms: “cannot be opened because Apple cannot check it for malicious software”, “cannot verify the developer”, or “is damaged and cannot be opened”.</w:t>
+      </w:r>
+    </w:p>
+    <w:p>
+      <w:r>
+        <w:rPr>
+          <w:b w:val="0"/>
+        </w:rPr>
+        <w:t>Cause: files downloaded from GitHub carry a macOS quarantine attribute, so the first launch is blocked by Gatekeeper.</w:t>
+      </w:r>
+    </w:p>
+    <w:p>
+      <w:r>
+        <w:rPr>
+          <w:b w:val="0"/>
+        </w:rPr>
+        <w:t>Fix (choose one): ① Right-click (or Control-click) Sequence-Evidence-Workbench.app → Open → click Open in the dialog; ② Open System Settings → Privacy &amp; Security → Security, then click Open Anyway (Allow Anyway); ③ If it still will not open, run in Terminal: xattr -dr com.apple.quarantine "/path/to/Sequence-Evidence-Workbench.app" (e.g. xattr -dr com.apple.quarantine ~/Downloads/Sequence-Evidence-Workbench.app); ④ If it says “damaged”, run the same command, then double-click to launch again.</w:t>
+      </w:r>
+    </w:p>
+    <w:p>
+      <w:r>
+        <w:rPr>
+          <w:b w:val="0"/>
+        </w:rPr>
+        <w:t>Note: apply this only when macOS blocks the app; clearing the quarantine attribute affects only your machine. If double-clicking Launch-Workbench.command does nothing, right-click it and choose Open.</w:t>
+      </w:r>
+    </w:p>
     <w:tbl>
       <w:tblPr>
         <w:tblStyle w:val="TableGrid"/>

</xml_diff>